<commit_message>
CN Notes: review pass on M01-M05 (fix bit-stuffing example + 3 wording nits)
Two independent read-only audits re-computed every numerical across M01-M05 (Nyquist/
Shannon, CRC/Hamming, ARQ efficiency, ALOHA, subnetting/VLSM/CIDR, fragmentation) —
all correct. Fixes applied:
- M03 §3.2 (CRITICAL): bit-stuffing example under-stuffed; data 0111111 0111110 has
  two runs of five 1s -> correct stuffed output 0111110101111100 (both 0s inserted).
- M01 §1.4: OSI transport delivery = both CO and CL (was 'both connection-oriented').
- M05 §5.9: IPv6 'majority' vs ~40% contradiction reworded.
- M05 §5.3: /29 (6 hosts) note — point-to-point is /30 or /31.
Verified: docx embeds intact, bordered tables, cross-ref chain M1->M6 correct.
</commit_message>
<xml_diff>
--- a/SITP/CN/Notes/M03_Data_Link_Layer.docx
+++ b/SITP/CN/Notes/M03_Data_Link_Layer.docx
@@ -1163,7 +1163,7 @@
         <w:t xml:space="preserve"> </w:t>
       </w:r>
       <w:r>
-        <w:t xml:space="preserve">data</w:t>
+        <w:t xml:space="preserve">the data</w:t>
       </w:r>
       <w:r>
         <w:t xml:space="preserve"> </w:t>
@@ -1178,34 +1178,100 @@
         <w:t xml:space="preserve"> </w:t>
       </w:r>
       <w:r>
-        <w:t xml:space="preserve">→</w:t>
-      </w:r>
-      <w:r>
-        <w:t xml:space="preserve"> </w:t>
-      </w:r>
-      <w:r>
-        <w:t xml:space="preserve">after every five 1s insert a 0 →</w:t>
-      </w:r>
-      <w:r>
-        <w:t xml:space="preserve"> </w:t>
-      </w:r>
+        <w:t xml:space="preserve">contains</w:t>
+      </w:r>
+      <w:r>
+        <w:t xml:space="preserve"> </w:t>
+      </w:r>
+      <w:r>
+        <w:rPr>
+          <w:b/>
+          <w:bCs/>
+        </w:rPr>
+        <w:t xml:space="preserve">two</w:t>
+      </w:r>
+      <w:r>
+        <w:t xml:space="preserve"> </w:t>
+      </w:r>
+      <w:r>
+        <w:t xml:space="preserve">runs of</w:t>
+      </w:r>
+      <w:r>
+        <w:t xml:space="preserve"> </w:t>
+      </w:r>
+      <w:r>
+        <w:t xml:space="preserve">five consecutive 1s, so the sender inserts a</w:t>
+      </w:r>
+      <w:r>
+        <w:t xml:space="preserve"> </w:t>
+      </w:r>
+      <w:r>
+        <w:rPr>
+          <w:b/>
+          <w:bCs/>
+        </w:rPr>
+        <w:t xml:space="preserve">0 after</w:t>
+      </w:r>
+      <w:r>
+        <w:rPr>
+          <w:b/>
+          <w:bCs/>
+        </w:rPr>
+        <w:t xml:space="preserve"> </w:t>
+      </w:r>
+      <w:r>
+        <w:rPr>
+          <w:b/>
+          <w:bCs/>
+          <w:i/>
+          <w:iCs/>
+        </w:rPr>
+        <w:t xml:space="preserve">each</w:t>
+      </w:r>
+      <w:r>
+        <w:rPr>
+          <w:b/>
+          <w:bCs/>
+        </w:rPr>
+        <w:t xml:space="preserve"> </w:t>
+      </w:r>
+      <w:r>
+        <w:rPr>
+          <w:b/>
+          <w:bCs/>
+        </w:rPr>
+        <w:t xml:space="preserve">fifth 1</w:t>
+      </w:r>
+      <w:r>
+        <w:t xml:space="preserve">:</w:t>
+      </w:r>
+    </w:p>
+    <w:p>
+      <w:pPr>
+        <w:pStyle w:val="SourceCode"/>
+      </w:pPr>
       <w:r>
         <w:rPr>
           <w:rStyle w:val="VerbatimChar"/>
         </w:rPr>
-        <w:t xml:space="preserve">011111**0**1 0111110</w:t>
-      </w:r>
-      <w:r>
-        <w:t xml:space="preserve"> </w:t>
-      </w:r>
-      <w:r>
-        <w:t xml:space="preserve">(sender stuffs a 0 after the</w:t>
-      </w:r>
-      <w:r>
-        <w:t xml:space="preserve"> </w:t>
-      </w:r>
-      <w:r>
-        <w:t xml:space="preserve">first five 1s). The receiver strips the stuffed 0 to recover the original.</w:t>
+        <w:t xml:space="preserve">data    : 0 11111 1 0 11111 0          (two runs of five 1s)</w:t>
+      </w:r>
+      <w:r>
+        <w:br/>
+      </w:r>
+      <w:r>
+        <w:rPr>
+          <w:rStyle w:val="VerbatimChar"/>
+        </w:rPr>
+        <w:t xml:space="preserve">stuffed : 0 11111[0] 1 0 11111[0] 0  -&gt;  0111110101111100</w:t>
+      </w:r>
+    </w:p>
+    <w:p>
+      <w:pPr>
+        <w:pStyle w:val="FirstParagraph"/>
+      </w:pPr>
+      <w:r>
+        <w:t xml:space="preserve">The receiver removes the 0 that follows any five 1s to recover the original.</w:t>
       </w:r>
     </w:p>
     <w:p>

</xml_diff>